<commit_message>
Updated minutes of meetings
</commit_message>
<xml_diff>
--- a/Documents/Meeting Minutes with Hobbs Client/01-25-2013 Hobbs Client Meeting - 3.docx
+++ b/Documents/Meeting Minutes with Hobbs Client/01-25-2013 Hobbs Client Meeting - 3.docx
@@ -558,15 +558,10 @@
               <w:t>and admin</w:t>
             </w:r>
             <w:r>
-              <w:t xml:space="preserve"> edit service use </w:t>
-            </w:r>
-            <w:proofErr w:type="gramStart"/>
-            <w:r>
-              <w:t>case,</w:t>
-            </w:r>
-            <w:proofErr w:type="gramEnd"/>
-            <w:r>
-              <w:t xml:space="preserve"> create staff use case</w:t>
+              <w:t xml:space="preserve"> edit service use-</w:t>
+            </w:r>
+            <w:r>
+              <w:t>case, create staff use case</w:t>
             </w:r>
             <w:r>
               <w:t xml:space="preserve"> to </w:t>
@@ -617,11 +612,9 @@
             <w:r>
               <w:t>. Feedback to improve colour and design scheme (</w:t>
             </w:r>
-            <w:proofErr w:type="spellStart"/>
-            <w:r>
-              <w:t>minamized</w:t>
-            </w:r>
-            <w:proofErr w:type="spellEnd"/>
+            <w:r>
+              <w:t>minimized</w:t>
+            </w:r>
             <w:r>
               <w:t xml:space="preserve"> layout), location of the Log In to be moved up on the right side of the navigation bar.</w:t>
             </w:r>
@@ -779,7 +772,7 @@
               <w:t xml:space="preserve"> </w:t>
             </w:r>
             <w:r>
-              <w:t>including database ER diagram and deployment diagram completed</w:t>
+              <w:t xml:space="preserve">including database ER diagram and deployment diagram </w:t>
             </w:r>
           </w:p>
         </w:tc>
@@ -823,8 +816,6 @@
             <w:r>
               <w:t>Registration</w:t>
             </w:r>
-            <w:bookmarkStart w:id="0" w:name="_GoBack"/>
-            <w:bookmarkEnd w:id="0"/>
             <w:r>
               <w:t xml:space="preserve">, </w:t>
             </w:r>
@@ -926,7 +917,13 @@
               <w:cnfStyle w:val="000000100000" w:firstRow="0" w:lastRow="0" w:firstColumn="0" w:lastColumn="0" w:oddVBand="0" w:evenVBand="0" w:oddHBand="1" w:evenHBand="0" w:firstRowFirstColumn="0" w:firstRowLastColumn="0" w:lastRowFirstColumn="0" w:lastRowLastColumn="0"/>
             </w:pPr>
             <w:r>
-              <w:t>Inputting service items, description, prices on the</w:t>
+              <w:t xml:space="preserve">Inputting service items, description, </w:t>
+            </w:r>
+            <w:r>
+              <w:t xml:space="preserve"> and </w:t>
+            </w:r>
+            <w:r>
+              <w:t>prices on the</w:t>
             </w:r>
             <w:r>
               <w:t xml:space="preserve"> order page</w:t>
@@ -935,10 +932,19 @@
               <w:t xml:space="preserve"> including </w:t>
             </w:r>
             <w:r>
-              <w:t xml:space="preserve"> slideshow </w:t>
-            </w:r>
-            <w:r>
-              <w:t xml:space="preserve">images </w:t>
+              <w:t xml:space="preserve"> </w:t>
+            </w:r>
+            <w:r>
+              <w:t>banner image</w:t>
+            </w:r>
+            <w:r>
+              <w:t>s</w:t>
+            </w:r>
+            <w:r>
+              <w:t xml:space="preserve"> displayed</w:t>
+            </w:r>
+            <w:r>
+              <w:t xml:space="preserve"> </w:t>
             </w:r>
             <w:r>
               <w:t>on</w:t>
@@ -1025,7 +1031,10 @@
         <w:t>Signed:</w:t>
       </w:r>
     </w:p>
-    <w:p/>
+    <w:p>
+      <w:bookmarkStart w:id="0" w:name="_GoBack"/>
+      <w:bookmarkEnd w:id="0"/>
+    </w:p>
     <w:p>
       <w:pPr>
         <w:ind w:firstLine="720"/>

</xml_diff>